<commit_message>
Deploying to gh-pages from @ ucdavis/ettbc@7b7c5508006a5f607a832551d741a98ec6b85a4f 🚀
</commit_message>
<xml_diff>
--- a/vignettes/getting-started.docx
+++ b/vignettes/getting-started.docx
@@ -41,12 +41,6 @@
         <w:pStyle w:val="FirstParagraph"/>
       </w:pPr>
       <w:r>
-        <w:t xml:space="preserve">This vignette provides an introduction to the</w:t>
-      </w:r>
-      <w:r>
-        <w:t xml:space="preserve"> </w:t>
-      </w:r>
-      <w:r>
         <w:rPr>
           <w:rStyle w:val="VerbatimChar"/>
         </w:rPr>
@@ -56,17 +50,56 @@
         <w:t xml:space="preserve"> </w:t>
       </w:r>
       <w:r>
-        <w:t xml:space="preserve">package.</w:t>
+        <w:t xml:space="preserve">emulates a target trial of screening mammography for breast cancer,</w:t>
+      </w:r>
+      <w:r>
+        <w:t xml:space="preserve"> </w:t>
+      </w:r>
+      <w:r>
+        <w:t xml:space="preserve">following the clone-censor-reweight methodology of García-Albéniz et al.</w:t>
+      </w:r>
+      <w:r>
+        <w:t xml:space="preserve"> </w:t>
+      </w:r>
+      <w:r>
+        <w:t xml:space="preserve">(2020). This vignette walks through the first two steps of the pipeline on</w:t>
+      </w:r>
+      <w:r>
+        <w:t xml:space="preserve"> </w:t>
+      </w:r>
+      <w:r>
+        <w:t xml:space="preserve">the package’s synthetic example data. For the full analysis — including</w:t>
+      </w:r>
+      <w:r>
+        <w:t xml:space="preserve"> </w:t>
+      </w:r>
+      <w:r>
+        <w:t xml:space="preserve">inverse-probability weighting, the outcome model, survival curves, and</w:t>
+      </w:r>
+      <w:r>
+        <w:t xml:space="preserve"> </w:t>
+      </w:r>
+      <w:r>
+        <w:t xml:space="preserve">bootstrap confidence intervals — see the article</w:t>
+      </w:r>
+      <w:r>
+        <w:t xml:space="preserve"> </w:t>
+      </w:r>
+      <w:r>
+        <w:t xml:space="preserve">“Using ettbc”</w:t>
+      </w:r>
+      <w:r>
+        <w:t xml:space="preserve">.</w:t>
       </w:r>
     </w:p>
     <w:bookmarkEnd w:id="9"/>
-    <w:bookmarkStart w:id="10" w:name="basic-usage"/>
+    <w:bookmarkStart w:id="10" w:name="example-data"/>
     <w:p>
       <w:pPr>
         <w:pStyle w:val="Heading2"/>
       </w:pPr>
       <w:r>
-        <w:t xml:space="preserve">2 Basic Usage</w:t>
+        <w:t xml:space="preserve">2 Example Data</w:t>
       </w:r>
     </w:p>
     <w:p>
@@ -74,7 +107,13 @@
         <w:pStyle w:val="FirstParagraph"/>
       </w:pPr>
       <w:r>
-        <w:t xml:space="preserve">Here’s a basic example:</w:t>
+        <w:t xml:space="preserve">The package ships three synthetic datasets that mimic the structure of the</w:t>
+      </w:r>
+      <w:r>
+        <w:t xml:space="preserve"> </w:t>
+      </w:r>
+      <w:r>
+        <w:t xml:space="preserve">original study data:</w:t>
       </w:r>
     </w:p>
     <w:p>
@@ -85,7 +124,7 @@
         <w:rPr>
           <w:rStyle w:val="CommentTok"/>
         </w:rPr>
-        <w:t xml:space="preserve"># Example usage</w:t>
+        <w:t xml:space="preserve"># One row per participant</w:t>
       </w:r>
       <w:r>
         <w:br/>
@@ -94,104 +133,86 @@
         <w:rPr>
           <w:rStyle w:val="FunctionTok"/>
         </w:rPr>
-        <w:t xml:space="preserve">example_function</w:t>
-      </w:r>
-      <w:r>
-        <w:rPr>
-          <w:rStyle w:val="NormalTok"/>
-        </w:rPr>
-        <w:t xml:space="preserve">(</w:t>
-      </w:r>
-      <w:r>
-        <w:rPr>
-          <w:rStyle w:val="FunctionTok"/>
-        </w:rPr>
-        <w:t xml:space="preserve">c</w:t>
-      </w:r>
-      <w:r>
-        <w:rPr>
-          <w:rStyle w:val="NormalTok"/>
-        </w:rPr>
-        <w:t xml:space="preserve">(</w:t>
-      </w:r>
-      <w:r>
-        <w:rPr>
-          <w:rStyle w:val="DecValTok"/>
-        </w:rPr>
-        <w:t xml:space="preserve">1</w:t>
-      </w:r>
-      <w:r>
-        <w:rPr>
-          <w:rStyle w:val="NormalTok"/>
-        </w:rPr>
-        <w:t xml:space="preserve">, </w:t>
-      </w:r>
-      <w:r>
-        <w:rPr>
-          <w:rStyle w:val="DecValTok"/>
-        </w:rPr>
-        <w:t xml:space="preserve">2</w:t>
-      </w:r>
-      <w:r>
-        <w:rPr>
-          <w:rStyle w:val="NormalTok"/>
-        </w:rPr>
-        <w:t xml:space="preserve">, </w:t>
-      </w:r>
-      <w:r>
-        <w:rPr>
-          <w:rStyle w:val="DecValTok"/>
-        </w:rPr>
-        <w:t xml:space="preserve">3</w:t>
-      </w:r>
-      <w:r>
-        <w:rPr>
-          <w:rStyle w:val="NormalTok"/>
-        </w:rPr>
-        <w:t xml:space="preserve">, </w:t>
-      </w:r>
-      <w:r>
-        <w:rPr>
-          <w:rStyle w:val="DecValTok"/>
-        </w:rPr>
-        <w:t xml:space="preserve">4</w:t>
-      </w:r>
-      <w:r>
-        <w:rPr>
-          <w:rStyle w:val="NormalTok"/>
-        </w:rPr>
-        <w:t xml:space="preserve">, </w:t>
-      </w:r>
-      <w:r>
-        <w:rPr>
-          <w:rStyle w:val="DecValTok"/>
-        </w:rPr>
-        <w:t xml:space="preserve">5</w:t>
-      </w:r>
-      <w:r>
-        <w:rPr>
-          <w:rStyle w:val="NormalTok"/>
-        </w:rPr>
-        <w:t xml:space="preserve">))</w:t>
-      </w:r>
-      <w:r>
-        <w:br/>
-      </w:r>
-      <w:r>
-        <w:rPr>
-          <w:rStyle w:val="CommentTok"/>
-        </w:rPr>
-        <w:t xml:space="preserve">#&gt; [1] 3</w:t>
+        <w:t xml:space="preserve">head</w:t>
+      </w:r>
+      <w:r>
+        <w:rPr>
+          <w:rStyle w:val="NormalTok"/>
+        </w:rPr>
+        <w:t xml:space="preserve">(cohort)</w:t>
+      </w:r>
+      <w:r>
+        <w:br/>
+      </w:r>
+      <w:r>
+        <w:rPr>
+          <w:rStyle w:val="CommentTok"/>
+        </w:rPr>
+        <w:t xml:space="preserve">#&gt;   id age start_month end_month death_month bc_death bc_month</w:t>
+      </w:r>
+      <w:r>
+        <w:br/>
+      </w:r>
+      <w:r>
+        <w:rPr>
+          <w:rStyle w:val="CommentTok"/>
+        </w:rPr>
+        <w:t xml:space="preserve">#&gt; 1  1  81          26       108          NA        0       NA</w:t>
+      </w:r>
+      <w:r>
+        <w:br/>
+      </w:r>
+      <w:r>
+        <w:rPr>
+          <w:rStyle w:val="CommentTok"/>
+        </w:rPr>
+        <w:t xml:space="preserve">#&gt; 2  2  81          33       108          NA        0       NA</w:t>
+      </w:r>
+      <w:r>
+        <w:br/>
+      </w:r>
+      <w:r>
+        <w:rPr>
+          <w:rStyle w:val="CommentTok"/>
+        </w:rPr>
+        <w:t xml:space="preserve">#&gt; 3  3  76          28       108          NA        0       NA</w:t>
+      </w:r>
+      <w:r>
+        <w:br/>
+      </w:r>
+      <w:r>
+        <w:rPr>
+          <w:rStyle w:val="CommentTok"/>
+        </w:rPr>
+        <w:t xml:space="preserve">#&gt; 4  4  75           1       108          NA        0       NA</w:t>
+      </w:r>
+      <w:r>
+        <w:br/>
+      </w:r>
+      <w:r>
+        <w:rPr>
+          <w:rStyle w:val="CommentTok"/>
+        </w:rPr>
+        <w:t xml:space="preserve">#&gt; 5  5  77          17       108          NA        0       NA</w:t>
+      </w:r>
+      <w:r>
+        <w:br/>
+      </w:r>
+      <w:r>
+        <w:rPr>
+          <w:rStyle w:val="CommentTok"/>
+        </w:rPr>
+        <w:t xml:space="preserve">#&gt; 6  6  70          40       108          NA        0       NA</w:t>
       </w:r>
     </w:p>
     <w:bookmarkEnd w:id="10"/>
-    <w:bookmarkStart w:id="11" w:name="next-steps"/>
+    <w:bookmarkStart w:id="11" w:name="step-1-clone-and-censor"/>
     <w:p>
       <w:pPr>
         <w:pStyle w:val="Heading2"/>
       </w:pPr>
       <w:r>
-        <w:t xml:space="preserve">3 Next Steps</w:t>
+        <w:t xml:space="preserve">3 Step 1: Clone and Censor</w:t>
       </w:r>
     </w:p>
     <w:p>
@@ -199,10 +220,608 @@
         <w:pStyle w:val="FirstParagraph"/>
       </w:pPr>
       <w:r>
-        <w:t xml:space="preserve">For more information, see the package documentation.</w:t>
+        <w:rPr>
+          <w:rStyle w:val="VerbatimChar"/>
+        </w:rPr>
+        <w:t xml:space="preserve">clone_censor()</w:t>
+      </w:r>
+      <w:r>
+        <w:t xml:space="preserve"> </w:t>
+      </w:r>
+      <w:r>
+        <w:t xml:space="preserve">replicates each participant into two trial arms — STOPBASE</w:t>
+      </w:r>
+      <w:r>
+        <w:t xml:space="preserve"> </w:t>
+      </w:r>
+      <w:r>
+        <w:t xml:space="preserve">(stop screening at entry) and CONTINUE (continue annual screening) — and</w:t>
+      </w:r>
+      <w:r>
+        <w:t xml:space="preserve"> </w:t>
+      </w:r>
+      <w:r>
+        <w:t xml:space="preserve">applies each arm’s censoring rule:</w:t>
+      </w:r>
+    </w:p>
+    <w:p>
+      <w:pPr>
+        <w:pStyle w:val="SourceCode"/>
+      </w:pPr>
+      <w:r>
+        <w:rPr>
+          <w:rStyle w:val="NormalTok"/>
+        </w:rPr>
+        <w:t xml:space="preserve">cloned </w:t>
+      </w:r>
+      <w:r>
+        <w:rPr>
+          <w:rStyle w:val="OtherTok"/>
+        </w:rPr>
+        <w:t xml:space="preserve">&lt;-</w:t>
+      </w:r>
+      <w:r>
+        <w:rPr>
+          <w:rStyle w:val="NormalTok"/>
+        </w:rPr>
+        <w:t xml:space="preserve"> </w:t>
+      </w:r>
+      <w:r>
+        <w:rPr>
+          <w:rStyle w:val="FunctionTok"/>
+        </w:rPr>
+        <w:t xml:space="preserve">clone_censor</w:t>
+      </w:r>
+      <w:r>
+        <w:rPr>
+          <w:rStyle w:val="NormalTok"/>
+        </w:rPr>
+        <w:t xml:space="preserve">(</w:t>
+      </w:r>
+      <w:r>
+        <w:br/>
+      </w:r>
+      <w:r>
+        <w:rPr>
+          <w:rStyle w:val="NormalTok"/>
+        </w:rPr>
+        <w:t xml:space="preserve">  cohort,</w:t>
+      </w:r>
+      <w:r>
+        <w:br/>
+      </w:r>
+      <w:r>
+        <w:rPr>
+          <w:rStyle w:val="NormalTok"/>
+        </w:rPr>
+        <w:t xml:space="preserve">  screening_mammograms,</w:t>
+      </w:r>
+      <w:r>
+        <w:br/>
+      </w:r>
+      <w:r>
+        <w:rPr>
+          <w:rStyle w:val="NormalTok"/>
+        </w:rPr>
+        <w:t xml:space="preserve">  diagnostic_mammograms</w:t>
+      </w:r>
+      <w:r>
+        <w:br/>
+      </w:r>
+      <w:r>
+        <w:rPr>
+          <w:rStyle w:val="NormalTok"/>
+        </w:rPr>
+        <w:t xml:space="preserve">)</w:t>
+      </w:r>
+      <w:r>
+        <w:br/>
+      </w:r>
+      <w:r>
+        <w:br/>
+      </w:r>
+      <w:r>
+        <w:rPr>
+          <w:rStyle w:val="FunctionTok"/>
+        </w:rPr>
+        <w:t xml:space="preserve">nrow</w:t>
+      </w:r>
+      <w:r>
+        <w:rPr>
+          <w:rStyle w:val="NormalTok"/>
+        </w:rPr>
+        <w:t xml:space="preserve">(cloned) </w:t>
+      </w:r>
+      <w:r>
+        <w:rPr>
+          <w:rStyle w:val="CommentTok"/>
+        </w:rPr>
+        <w:t xml:space="preserve"># two rows per participant</w:t>
+      </w:r>
+      <w:r>
+        <w:br/>
+      </w:r>
+      <w:r>
+        <w:rPr>
+          <w:rStyle w:val="CommentTok"/>
+        </w:rPr>
+        <w:t xml:space="preserve">#&gt; [1] 200</w:t>
+      </w:r>
+      <w:r>
+        <w:br/>
+      </w:r>
+      <w:r>
+        <w:rPr>
+          <w:rStyle w:val="FunctionTok"/>
+        </w:rPr>
+        <w:t xml:space="preserve">head</w:t>
+      </w:r>
+      <w:r>
+        <w:rPr>
+          <w:rStyle w:val="NormalTok"/>
+        </w:rPr>
+        <w:t xml:space="preserve">(cloned[, </w:t>
+      </w:r>
+      <w:r>
+        <w:rPr>
+          <w:rStyle w:val="FunctionTok"/>
+        </w:rPr>
+        <w:t xml:space="preserve">c</w:t>
+      </w:r>
+      <w:r>
+        <w:rPr>
+          <w:rStyle w:val="NormalTok"/>
+        </w:rPr>
+        <w:t xml:space="preserve">(</w:t>
+      </w:r>
+      <w:r>
+        <w:rPr>
+          <w:rStyle w:val="StringTok"/>
+        </w:rPr>
+        <w:t xml:space="preserve">"id"</w:t>
+      </w:r>
+      <w:r>
+        <w:rPr>
+          <w:rStyle w:val="NormalTok"/>
+        </w:rPr>
+        <w:t xml:space="preserve">, </w:t>
+      </w:r>
+      <w:r>
+        <w:rPr>
+          <w:rStyle w:val="StringTok"/>
+        </w:rPr>
+        <w:t xml:space="preserve">"arm"</w:t>
+      </w:r>
+      <w:r>
+        <w:rPr>
+          <w:rStyle w:val="NormalTok"/>
+        </w:rPr>
+        <w:t xml:space="preserve">, </w:t>
+      </w:r>
+      <w:r>
+        <w:rPr>
+          <w:rStyle w:val="StringTok"/>
+        </w:rPr>
+        <w:t xml:space="preserve">"start_month"</w:t>
+      </w:r>
+      <w:r>
+        <w:rPr>
+          <w:rStyle w:val="NormalTok"/>
+        </w:rPr>
+        <w:t xml:space="preserve">, </w:t>
+      </w:r>
+      <w:r>
+        <w:rPr>
+          <w:rStyle w:val="StringTok"/>
+        </w:rPr>
+        <w:t xml:space="preserve">"end_month"</w:t>
+      </w:r>
+      <w:r>
+        <w:rPr>
+          <w:rStyle w:val="NormalTok"/>
+        </w:rPr>
+        <w:t xml:space="preserve">, </w:t>
+      </w:r>
+      <w:r>
+        <w:rPr>
+          <w:rStyle w:val="StringTok"/>
+        </w:rPr>
+        <w:t xml:space="preserve">"fup"</w:t>
+      </w:r>
+      <w:r>
+        <w:rPr>
+          <w:rStyle w:val="NormalTok"/>
+        </w:rPr>
+        <w:t xml:space="preserve">, </w:t>
+      </w:r>
+      <w:r>
+        <w:rPr>
+          <w:rStyle w:val="StringTok"/>
+        </w:rPr>
+        <w:t xml:space="preserve">"bc_died"</w:t>
+      </w:r>
+      <w:r>
+        <w:rPr>
+          <w:rStyle w:val="NormalTok"/>
+        </w:rPr>
+        <w:t xml:space="preserve">)])</w:t>
+      </w:r>
+      <w:r>
+        <w:br/>
+      </w:r>
+      <w:r>
+        <w:rPr>
+          <w:rStyle w:val="CommentTok"/>
+        </w:rPr>
+        <w:t xml:space="preserve">#&gt;   id      arm start_month end_month fup bc_died</w:t>
+      </w:r>
+      <w:r>
+        <w:br/>
+      </w:r>
+      <w:r>
+        <w:rPr>
+          <w:rStyle w:val="CommentTok"/>
+        </w:rPr>
+        <w:t xml:space="preserve">#&gt; 1  1 STOPBASE          26        38  13       0</w:t>
+      </w:r>
+      <w:r>
+        <w:br/>
+      </w:r>
+      <w:r>
+        <w:rPr>
+          <w:rStyle w:val="CommentTok"/>
+        </w:rPr>
+        <w:t xml:space="preserve">#&gt; 2  2 STOPBASE          33        45  13       0</w:t>
+      </w:r>
+      <w:r>
+        <w:br/>
+      </w:r>
+      <w:r>
+        <w:rPr>
+          <w:rStyle w:val="CommentTok"/>
+        </w:rPr>
+        <w:t xml:space="preserve">#&gt; 3  3 STOPBASE          28        42  15       0</w:t>
+      </w:r>
+      <w:r>
+        <w:br/>
+      </w:r>
+      <w:r>
+        <w:rPr>
+          <w:rStyle w:val="CommentTok"/>
+        </w:rPr>
+        <w:t xml:space="preserve">#&gt; 4  4 STOPBASE           1        12  12       0</w:t>
+      </w:r>
+      <w:r>
+        <w:br/>
+      </w:r>
+      <w:r>
+        <w:rPr>
+          <w:rStyle w:val="CommentTok"/>
+        </w:rPr>
+        <w:t xml:space="preserve">#&gt; 5  5 STOPBASE          17        28  12       0</w:t>
+      </w:r>
+      <w:r>
+        <w:br/>
+      </w:r>
+      <w:r>
+        <w:rPr>
+          <w:rStyle w:val="CommentTok"/>
+        </w:rPr>
+        <w:t xml:space="preserve">#&gt; 6  6 STOPBASE          40        52  13       0</w:t>
       </w:r>
     </w:p>
     <w:bookmarkEnd w:id="11"/>
+    <w:bookmarkStart w:id="12" w:name="step-2-expand-to-long-format"/>
+    <w:p>
+      <w:pPr>
+        <w:pStyle w:val="Heading2"/>
+      </w:pPr>
+      <w:r>
+        <w:t xml:space="preserve">4 Step 2: Expand to Long Format</w:t>
+      </w:r>
+    </w:p>
+    <w:p>
+      <w:pPr>
+        <w:pStyle w:val="FirstParagraph"/>
+      </w:pPr>
+      <w:r>
+        <w:rPr>
+          <w:rStyle w:val="VerbatimChar"/>
+        </w:rPr>
+        <w:t xml:space="preserve">expand_to_long()</w:t>
+      </w:r>
+      <w:r>
+        <w:t xml:space="preserve"> </w:t>
+      </w:r>
+      <w:r>
+        <w:t xml:space="preserve">converts the cloned data to one row per</w:t>
+      </w:r>
+      <w:r>
+        <w:t xml:space="preserve"> </w:t>
+      </w:r>
+      <w:r>
+        <w:t xml:space="preserve">participant-arm-month, ready for discrete-time survival analysis:</w:t>
+      </w:r>
+    </w:p>
+    <w:p>
+      <w:pPr>
+        <w:pStyle w:val="SourceCode"/>
+      </w:pPr>
+      <w:r>
+        <w:rPr>
+          <w:rStyle w:val="NormalTok"/>
+        </w:rPr>
+        <w:t xml:space="preserve">long </w:t>
+      </w:r>
+      <w:r>
+        <w:rPr>
+          <w:rStyle w:val="OtherTok"/>
+        </w:rPr>
+        <w:t xml:space="preserve">&lt;-</w:t>
+      </w:r>
+      <w:r>
+        <w:rPr>
+          <w:rStyle w:val="NormalTok"/>
+        </w:rPr>
+        <w:t xml:space="preserve"> </w:t>
+      </w:r>
+      <w:r>
+        <w:rPr>
+          <w:rStyle w:val="FunctionTok"/>
+        </w:rPr>
+        <w:t xml:space="preserve">expand_to_long</w:t>
+      </w:r>
+      <w:r>
+        <w:rPr>
+          <w:rStyle w:val="NormalTok"/>
+        </w:rPr>
+        <w:t xml:space="preserve">(cloned)</w:t>
+      </w:r>
+      <w:r>
+        <w:br/>
+      </w:r>
+      <w:r>
+        <w:rPr>
+          <w:rStyle w:val="FunctionTok"/>
+        </w:rPr>
+        <w:t xml:space="preserve">head</w:t>
+      </w:r>
+      <w:r>
+        <w:rPr>
+          <w:rStyle w:val="NormalTok"/>
+        </w:rPr>
+        <w:t xml:space="preserve">(long[, </w:t>
+      </w:r>
+      <w:r>
+        <w:rPr>
+          <w:rStyle w:val="FunctionTok"/>
+        </w:rPr>
+        <w:t xml:space="preserve">c</w:t>
+      </w:r>
+      <w:r>
+        <w:rPr>
+          <w:rStyle w:val="NormalTok"/>
+        </w:rPr>
+        <w:t xml:space="preserve">(</w:t>
+      </w:r>
+      <w:r>
+        <w:rPr>
+          <w:rStyle w:val="StringTok"/>
+        </w:rPr>
+        <w:t xml:space="preserve">"id"</w:t>
+      </w:r>
+      <w:r>
+        <w:rPr>
+          <w:rStyle w:val="NormalTok"/>
+        </w:rPr>
+        <w:t xml:space="preserve">, </w:t>
+      </w:r>
+      <w:r>
+        <w:rPr>
+          <w:rStyle w:val="StringTok"/>
+        </w:rPr>
+        <w:t xml:space="preserve">"arm"</w:t>
+      </w:r>
+      <w:r>
+        <w:rPr>
+          <w:rStyle w:val="NormalTok"/>
+        </w:rPr>
+        <w:t xml:space="preserve">, </w:t>
+      </w:r>
+      <w:r>
+        <w:rPr>
+          <w:rStyle w:val="StringTok"/>
+        </w:rPr>
+        <w:t xml:space="preserve">"month"</w:t>
+      </w:r>
+      <w:r>
+        <w:rPr>
+          <w:rStyle w:val="NormalTok"/>
+        </w:rPr>
+        <w:t xml:space="preserve">, </w:t>
+      </w:r>
+      <w:r>
+        <w:rPr>
+          <w:rStyle w:val="StringTok"/>
+        </w:rPr>
+        <w:t xml:space="preserve">"month2"</w:t>
+      </w:r>
+      <w:r>
+        <w:rPr>
+          <w:rStyle w:val="NormalTok"/>
+        </w:rPr>
+        <w:t xml:space="preserve">, </w:t>
+      </w:r>
+      <w:r>
+        <w:rPr>
+          <w:rStyle w:val="StringTok"/>
+        </w:rPr>
+        <w:t xml:space="preserve">"dead_t1"</w:t>
+      </w:r>
+      <w:r>
+        <w:rPr>
+          <w:rStyle w:val="NormalTok"/>
+        </w:rPr>
+        <w:t xml:space="preserve">)])</w:t>
+      </w:r>
+      <w:r>
+        <w:br/>
+      </w:r>
+      <w:r>
+        <w:rPr>
+          <w:rStyle w:val="CommentTok"/>
+        </w:rPr>
+        <w:t xml:space="preserve">#&gt;   id      arm month month2 dead_t1</w:t>
+      </w:r>
+      <w:r>
+        <w:br/>
+      </w:r>
+      <w:r>
+        <w:rPr>
+          <w:rStyle w:val="CommentTok"/>
+        </w:rPr>
+        <w:t xml:space="preserve">#&gt; 1  1 STOPBASE    26      0       0</w:t>
+      </w:r>
+      <w:r>
+        <w:br/>
+      </w:r>
+      <w:r>
+        <w:rPr>
+          <w:rStyle w:val="CommentTok"/>
+        </w:rPr>
+        <w:t xml:space="preserve">#&gt; 2  1 STOPBASE    27      1       0</w:t>
+      </w:r>
+      <w:r>
+        <w:br/>
+      </w:r>
+      <w:r>
+        <w:rPr>
+          <w:rStyle w:val="CommentTok"/>
+        </w:rPr>
+        <w:t xml:space="preserve">#&gt; 3  1 STOPBASE    28      2       0</w:t>
+      </w:r>
+      <w:r>
+        <w:br/>
+      </w:r>
+      <w:r>
+        <w:rPr>
+          <w:rStyle w:val="CommentTok"/>
+        </w:rPr>
+        <w:t xml:space="preserve">#&gt; 4  1 STOPBASE    29      3       0</w:t>
+      </w:r>
+      <w:r>
+        <w:br/>
+      </w:r>
+      <w:r>
+        <w:rPr>
+          <w:rStyle w:val="CommentTok"/>
+        </w:rPr>
+        <w:t xml:space="preserve">#&gt; 5  1 STOPBASE    30      4       0</w:t>
+      </w:r>
+      <w:r>
+        <w:br/>
+      </w:r>
+      <w:r>
+        <w:rPr>
+          <w:rStyle w:val="CommentTok"/>
+        </w:rPr>
+        <w:t xml:space="preserve">#&gt; 6  1 STOPBASE    31      5       0</w:t>
+      </w:r>
+    </w:p>
+    <w:bookmarkEnd w:id="12"/>
+    <w:bookmarkStart w:id="13" w:name="next-steps"/>
+    <w:p>
+      <w:pPr>
+        <w:pStyle w:val="Heading2"/>
+      </w:pPr>
+      <w:r>
+        <w:t xml:space="preserve">5 Next Steps</w:t>
+      </w:r>
+    </w:p>
+    <w:p>
+      <w:pPr>
+        <w:pStyle w:val="FirstParagraph"/>
+      </w:pPr>
+      <w:r>
+        <w:t xml:space="preserve">From the long-format data you can compute inverse-probability weights with</w:t>
+      </w:r>
+      <w:r>
+        <w:t xml:space="preserve"> </w:t>
+      </w:r>
+      <w:r>
+        <w:rPr>
+          <w:rStyle w:val="VerbatimChar"/>
+        </w:rPr>
+        <w:t xml:space="preserve">compute_ipw_weights()</w:t>
+      </w:r>
+      <w:r>
+        <w:t xml:space="preserve">, fit the outcome model with</w:t>
+      </w:r>
+      <w:r>
+        <w:t xml:space="preserve"> </w:t>
+      </w:r>
+      <w:r>
+        <w:rPr>
+          <w:rStyle w:val="VerbatimChar"/>
+        </w:rPr>
+        <w:t xml:space="preserve">fit_outcome_hr()</w:t>
+      </w:r>
+      <w:r>
+        <w:t xml:space="preserve">,</w:t>
+      </w:r>
+      <w:r>
+        <w:t xml:space="preserve"> </w:t>
+      </w:r>
+      <w:r>
+        <w:t xml:space="preserve">estimate marginal survival curves with the</w:t>
+      </w:r>
+      <w:r>
+        <w:t xml:space="preserve"> </w:t>
+      </w:r>
+      <w:r>
+        <w:rPr>
+          <w:rStyle w:val="VerbatimChar"/>
+        </w:rPr>
+        <w:t xml:space="preserve">predict_survival_*()</w:t>
+      </w:r>
+      <w:r>
+        <w:t xml:space="preserve"> </w:t>
+      </w:r>
+      <w:r>
+        <w:t xml:space="preserve">functions,</w:t>
+      </w:r>
+      <w:r>
+        <w:t xml:space="preserve"> </w:t>
+      </w:r>
+      <w:r>
+        <w:t xml:space="preserve">and obtain confidence intervals with</w:t>
+      </w:r>
+      <w:r>
+        <w:t xml:space="preserve"> </w:t>
+      </w:r>
+      <w:r>
+        <w:rPr>
+          <w:rStyle w:val="VerbatimChar"/>
+        </w:rPr>
+        <w:t xml:space="preserve">bootstrap_ci()</w:t>
+      </w:r>
+      <w:r>
+        <w:t xml:space="preserve">. The article</w:t>
+      </w:r>
+      <w:r>
+        <w:t xml:space="preserve"> </w:t>
+      </w:r>
+      <w:r>
+        <w:t xml:space="preserve">“Using ettbc”</w:t>
+      </w:r>
+      <w:r>
+        <w:t xml:space="preserve"> </w:t>
+      </w:r>
+      <w:r>
+        <w:t xml:space="preserve">demonstrates the full pipeline.</w:t>
+      </w:r>
+    </w:p>
+    <w:bookmarkEnd w:id="13"/>
     <w:sectPr>
       <w:footnotePr>
         <w:numRestart w:val="eachSect"/>

</xml_diff>